<commit_message>
Implement Environment Management for EKS, AKS, GKE and OCI OKE
</commit_message>
<xml_diff>
--- a/docs/Navigan_Environment_Management_Specification_v1.docx
+++ b/docs/Navigan_Environment_Management_Specification_v1.docx
@@ -25,97 +25,17 @@
         <w:pStyle w:val="FirstParagraph"/>
       </w:pPr>
       <w:r>
-        <w:rPr>
-          <w:b/>
-          <w:bCs/>
-        </w:rPr>
-        <w:t xml:space="preserve">Document Version:</w:t>
-      </w:r>
-      <w:r>
-        <w:t xml:space="preserve"> </w:t>
-      </w:r>
-      <w:r>
-        <w:t xml:space="preserve">1.0</w:t>
-      </w:r>
-      <w:r>
-        <w:br/>
-      </w:r>
-      <w:r>
-        <w:rPr>
-          <w:b/>
-          <w:bCs/>
-        </w:rPr>
-        <w:t xml:space="preserve">Module:</w:t>
-      </w:r>
-      <w:r>
-        <w:t xml:space="preserve"> </w:t>
-      </w:r>
-      <w:r>
-        <w:t xml:space="preserve">Environment Management</w:t>
-      </w:r>
-      <w:r>
-        <w:br/>
-      </w:r>
-      <w:r>
-        <w:rPr>
-          <w:b/>
-          <w:bCs/>
-        </w:rPr>
-        <w:t xml:space="preserve">Platform Type:</w:t>
-      </w:r>
-      <w:r>
-        <w:t xml:space="preserve"> </w:t>
-      </w:r>
-      <w:r>
-        <w:t xml:space="preserve">SaaS – Container Management Platform</w:t>
-      </w:r>
-      <w:r>
-        <w:br/>
-      </w:r>
-      <w:r>
-        <w:rPr>
-          <w:b/>
-          <w:bCs/>
-        </w:rPr>
-        <w:t xml:space="preserve">Primary Personas:</w:t>
-      </w:r>
-      <w:r>
-        <w:t xml:space="preserve"> </w:t>
-      </w:r>
-      <w:r>
-        <w:t xml:space="preserve">Cloud Engineer, Platform Architect</w:t>
-      </w:r>
-      <w:r>
-        <w:br/>
-      </w:r>
-      <w:r>
-        <w:rPr>
-          <w:b/>
-          <w:bCs/>
-        </w:rPr>
-        <w:t xml:space="preserve">Dependent Module:</w:t>
-      </w:r>
-      <w:r>
-        <w:t xml:space="preserve"> </w:t>
-      </w:r>
-      <w:r>
-        <w:t xml:space="preserve">Customer Management</w:t>
-      </w:r>
-      <w:r>
-        <w:br/>
-      </w:r>
-      <w:r>
-        <w:rPr>
-          <w:b/>
-          <w:bCs/>
-        </w:rPr>
-        <w:t xml:space="preserve">Consumer Module:</w:t>
-      </w:r>
-      <w:r>
-        <w:t xml:space="preserve"> </w:t>
-      </w:r>
-      <w:r>
-        <w:t xml:space="preserve">Cluster Management</w:t>
+        <w:t>Document Version: 1.1 (multi-distribution implementation)</w:t>
+        <w:br/>
+        <w:t>Module: Environment Management</w:t>
+        <w:br/>
+        <w:t>Platform Type: SaaS – Container Management Platform</w:t>
+        <w:br/>
+        <w:t>Primary Personas: Cloud Engineer, Platform Architect</w:t>
+        <w:br/>
+        <w:t>Dependent Module: Customer Management</w:t>
+        <w:br/>
+        <w:t>Consumer Module: Cluster Management</w:t>
       </w:r>
     </w:p>
     <w:p>
@@ -18405,6 +18325,7 @@
       <w:tr>
         <w:trPr>
           <w:tblHeader w:val="on"/>
+          <w:cantSplit/>
         </w:trPr>
         <w:tc>
           <w:tcPr/>
@@ -18452,6 +18373,9 @@
         </w:tc>
       </w:tr>
       <w:tr>
+        <w:trPr>
+          <w:cantSplit/>
+        </w:trPr>
         <w:tc>
           <w:tcPr/>
           <w:p>
@@ -18498,6 +18422,9 @@
         </w:tc>
       </w:tr>
       <w:tr>
+        <w:trPr>
+          <w:cantSplit/>
+        </w:trPr>
         <w:tc>
           <w:tcPr/>
           <w:p>
@@ -18544,6 +18471,9 @@
         </w:tc>
       </w:tr>
       <w:tr>
+        <w:trPr>
+          <w:cantSplit/>
+        </w:trPr>
         <w:tc>
           <w:tcPr/>
           <w:p>
@@ -18590,6 +18520,9 @@
         </w:tc>
       </w:tr>
       <w:tr>
+        <w:trPr>
+          <w:cantSplit/>
+        </w:trPr>
         <w:tc>
           <w:tcPr/>
           <w:p>
@@ -18636,6 +18569,9 @@
         </w:tc>
       </w:tr>
       <w:tr>
+        <w:trPr>
+          <w:cantSplit/>
+        </w:trPr>
         <w:tc>
           <w:tcPr/>
           <w:p>
@@ -18682,6 +18618,9 @@
         </w:tc>
       </w:tr>
       <w:tr>
+        <w:trPr>
+          <w:cantSplit/>
+        </w:trPr>
         <w:tc>
           <w:tcPr/>
           <w:p>
@@ -18728,6 +18667,9 @@
         </w:tc>
       </w:tr>
       <w:tr>
+        <w:trPr>
+          <w:cantSplit/>
+        </w:trPr>
         <w:tc>
           <w:tcPr/>
           <w:p>
@@ -18774,6 +18716,9 @@
         </w:tc>
       </w:tr>
       <w:tr>
+        <w:trPr>
+          <w:cantSplit/>
+        </w:trPr>
         <w:tc>
           <w:tcPr/>
           <w:p>
@@ -18820,6 +18765,9 @@
         </w:tc>
       </w:tr>
       <w:tr>
+        <w:trPr>
+          <w:cantSplit/>
+        </w:trPr>
         <w:tc>
           <w:tcPr/>
           <w:p>
@@ -18866,6 +18814,9 @@
         </w:tc>
       </w:tr>
       <w:tr>
+        <w:trPr>
+          <w:cantSplit/>
+        </w:trPr>
         <w:tc>
           <w:tcPr/>
           <w:p>
@@ -18912,6 +18863,9 @@
         </w:tc>
       </w:tr>
       <w:tr>
+        <w:trPr>
+          <w:cantSplit/>
+        </w:trPr>
         <w:tc>
           <w:tcPr/>
           <w:p>
@@ -19052,6 +19006,7 @@
       <w:tr>
         <w:trPr>
           <w:tblHeader w:val="on"/>
+          <w:cantSplit/>
         </w:trPr>
         <w:tc>
           <w:tcPr/>
@@ -19090,6 +19045,9 @@
         </w:tc>
       </w:tr>
       <w:tr>
+        <w:trPr>
+          <w:cantSplit/>
+        </w:trPr>
         <w:tc>
           <w:tcPr/>
           <w:p>
@@ -19127,6 +19085,9 @@
         </w:tc>
       </w:tr>
       <w:tr>
+        <w:trPr>
+          <w:cantSplit/>
+        </w:trPr>
         <w:tc>
           <w:tcPr/>
           <w:p>
@@ -19164,6 +19125,9 @@
         </w:tc>
       </w:tr>
       <w:tr>
+        <w:trPr>
+          <w:cantSplit/>
+        </w:trPr>
         <w:tc>
           <w:tcPr/>
           <w:p>
@@ -19201,6 +19165,9 @@
         </w:tc>
       </w:tr>
       <w:tr>
+        <w:trPr>
+          <w:cantSplit/>
+        </w:trPr>
         <w:tc>
           <w:tcPr/>
           <w:p>
@@ -19238,6 +19205,9 @@
         </w:tc>
       </w:tr>
       <w:tr>
+        <w:trPr>
+          <w:cantSplit/>
+        </w:trPr>
         <w:tc>
           <w:tcPr/>
           <w:p>
@@ -19275,6 +19245,9 @@
         </w:tc>
       </w:tr>
       <w:tr>
+        <w:trPr>
+          <w:cantSplit/>
+        </w:trPr>
         <w:tc>
           <w:tcPr/>
           <w:p>
@@ -19312,6 +19285,9 @@
         </w:tc>
       </w:tr>
       <w:tr>
+        <w:trPr>
+          <w:cantSplit/>
+        </w:trPr>
         <w:tc>
           <w:tcPr/>
           <w:p>
@@ -19349,6 +19325,9 @@
         </w:tc>
       </w:tr>
       <w:tr>
+        <w:trPr>
+          <w:cantSplit/>
+        </w:trPr>
         <w:tc>
           <w:tcPr/>
           <w:p>
@@ -19386,6 +19365,9 @@
         </w:tc>
       </w:tr>
       <w:tr>
+        <w:trPr>
+          <w:cantSplit/>
+        </w:trPr>
         <w:tc>
           <w:tcPr/>
           <w:p>
@@ -19423,6 +19405,9 @@
         </w:tc>
       </w:tr>
       <w:tr>
+        <w:trPr>
+          <w:cantSplit/>
+        </w:trPr>
         <w:tc>
           <w:tcPr/>
           <w:p>
@@ -19460,6 +19445,9 @@
         </w:tc>
       </w:tr>
       <w:tr>
+        <w:trPr>
+          <w:cantSplit/>
+        </w:trPr>
         <w:tc>
           <w:tcPr/>
           <w:p>
@@ -19497,6 +19485,9 @@
         </w:tc>
       </w:tr>
       <w:tr>
+        <w:trPr>
+          <w:cantSplit/>
+        </w:trPr>
         <w:tc>
           <w:tcPr/>
           <w:p>
@@ -19534,6 +19525,9 @@
         </w:tc>
       </w:tr>
       <w:tr>
+        <w:trPr>
+          <w:cantSplit/>
+        </w:trPr>
         <w:tc>
           <w:tcPr/>
           <w:p>
@@ -19571,6 +19565,9 @@
         </w:tc>
       </w:tr>
       <w:tr>
+        <w:trPr>
+          <w:cantSplit/>
+        </w:trPr>
         <w:tc>
           <w:tcPr/>
           <w:p>
@@ -19608,6 +19605,9 @@
         </w:tc>
       </w:tr>
       <w:tr>
+        <w:trPr>
+          <w:cantSplit/>
+        </w:trPr>
         <w:tc>
           <w:tcPr/>
           <w:p>
@@ -19645,6 +19645,9 @@
         </w:tc>
       </w:tr>
       <w:tr>
+        <w:trPr>
+          <w:cantSplit/>
+        </w:trPr>
         <w:tc>
           <w:tcPr/>
           <w:p>
@@ -19682,6 +19685,9 @@
         </w:tc>
       </w:tr>
       <w:tr>
+        <w:trPr>
+          <w:cantSplit/>
+        </w:trPr>
         <w:tc>
           <w:tcPr/>
           <w:p>
@@ -22095,7 +22101,7 @@
         <w:pStyle w:val="FirstParagraph"/>
       </w:pPr>
       <w:r>
-        <w:t xml:space="preserve">Each provider should have its own schema.</w:t>
+        <w:t>Each provider and Kubernetes distribution has a versioned JSON Schema; see section 64.</w:t>
       </w:r>
     </w:p>
     <w:p>
@@ -22529,6 +22535,7 @@
       <w:tr>
         <w:trPr>
           <w:tblHeader w:val="on"/>
+          <w:cantSplit/>
         </w:trPr>
         <w:tc>
           <w:tcPr/>
@@ -22565,6 +22572,9 @@
         </w:tc>
       </w:tr>
       <w:tr>
+        <w:trPr>
+          <w:cantSplit/>
+        </w:trPr>
         <w:tc>
           <w:tcPr/>
           <w:p>
@@ -22603,6 +22613,9 @@
         </w:tc>
       </w:tr>
       <w:tr>
+        <w:trPr>
+          <w:cantSplit/>
+        </w:trPr>
         <w:tc>
           <w:tcPr/>
           <w:p>
@@ -22641,6 +22654,9 @@
         </w:tc>
       </w:tr>
       <w:tr>
+        <w:trPr>
+          <w:cantSplit/>
+        </w:trPr>
         <w:tc>
           <w:tcPr/>
           <w:p>
@@ -22679,6 +22695,9 @@
         </w:tc>
       </w:tr>
       <w:tr>
+        <w:trPr>
+          <w:cantSplit/>
+        </w:trPr>
         <w:tc>
           <w:tcPr/>
           <w:p>
@@ -22717,6 +22736,9 @@
         </w:tc>
       </w:tr>
       <w:tr>
+        <w:trPr>
+          <w:cantSplit/>
+        </w:trPr>
         <w:tc>
           <w:tcPr/>
           <w:p>
@@ -22755,6 +22777,9 @@
         </w:tc>
       </w:tr>
       <w:tr>
+        <w:trPr>
+          <w:cantSplit/>
+        </w:trPr>
         <w:tc>
           <w:tcPr/>
           <w:p>
@@ -22793,6 +22818,9 @@
         </w:tc>
       </w:tr>
       <w:tr>
+        <w:trPr>
+          <w:cantSplit/>
+        </w:trPr>
         <w:tc>
           <w:tcPr/>
           <w:p>
@@ -22831,6 +22859,9 @@
         </w:tc>
       </w:tr>
       <w:tr>
+        <w:trPr>
+          <w:cantSplit/>
+        </w:trPr>
         <w:tc>
           <w:tcPr/>
           <w:p>
@@ -22869,6 +22900,9 @@
         </w:tc>
       </w:tr>
       <w:tr>
+        <w:trPr>
+          <w:cantSplit/>
+        </w:trPr>
         <w:tc>
           <w:tcPr/>
           <w:p>
@@ -22907,6 +22941,9 @@
         </w:tc>
       </w:tr>
       <w:tr>
+        <w:trPr>
+          <w:cantSplit/>
+        </w:trPr>
         <w:tc>
           <w:tcPr/>
           <w:p>
@@ -22945,6 +22982,9 @@
         </w:tc>
       </w:tr>
       <w:tr>
+        <w:trPr>
+          <w:cantSplit/>
+        </w:trPr>
         <w:tc>
           <w:tcPr/>
           <w:p>
@@ -22983,6 +23023,9 @@
         </w:tc>
       </w:tr>
       <w:tr>
+        <w:trPr>
+          <w:cantSplit/>
+        </w:trPr>
         <w:tc>
           <w:tcPr/>
           <w:p>
@@ -23021,6 +23064,9 @@
         </w:tc>
       </w:tr>
       <w:tr>
+        <w:trPr>
+          <w:cantSplit/>
+        </w:trPr>
         <w:tc>
           <w:tcPr/>
           <w:p>
@@ -23690,7 +23736,7 @@
         </w:numPr>
       </w:pPr>
       <w:r>
-        <w:t xml:space="preserve">AWS environment schema implemented</w:t>
+        <w:t>EKS, AKS, GKE and OKE environment schemas implemented</w:t>
       </w:r>
     </w:p>
     <w:p>
@@ -24576,7 +24622,7 @@
         <w:pStyle w:val="BlockText"/>
       </w:pPr>
       <w:r>
-        <w:t xml:space="preserve">Initially implement the detailed AWS EKS environment schema described in this specification.</w:t>
+        <w:t>Implement AWS/EKS, Azure/AKS, GCP/GKE and OCI/OKE schemas and dynamic forms described in sections 64–69.</w:t>
       </w:r>
     </w:p>
     <w:p>
@@ -24664,10 +24710,610 @@
         <w:pStyle w:val="BlockText"/>
       </w:pPr>
       <w:r>
-        <w:t xml:space="preserve">The service must be stateless, container-ready and deployable on Kubernetes.</w:t>
+        <w:t>The service is stateless Python 3.12 deployed on AWS Lambda in its own nested CloudFormation stack, exposed through the shared API Gateway. The frontend runs on ECS Fargate.</w:t>
       </w:r>
     </w:p>
     <w:bookmarkEnd w:id="104"/>
+    <w:p>
+      <w:pPr>
+        <w:pStyle w:val="Heading1"/>
+      </w:pPr>
+      <w:r>
+        <w:t>64. Multi-distribution configuration contract</w:t>
+      </w:r>
+    </w:p>
+    <w:p>
+      <w:r>
+        <w:t>This implementation amendment extends the EKS baseline and resolves earlier recommendations into the deployed API contract. It takes precedence where examples in sections 23–63 omit concurrency or distribution fields. OCI is the cloud provider; OKE is its Kubernetes distribution. No cloud resources are provisioned by this module.</w:t>
+      </w:r>
+    </w:p>
+    <w:p>
+      <w:pPr>
+        <w:pStyle w:val="Compact"/>
+        <w:numPr>
+          <w:ilvl w:val="0"/>
+          <w:numId w:val="1061"/>
+        </w:numPr>
+      </w:pPr>
+      <w:r>
+        <w:t>AWS → EKS; AZURE → AKS; GCP → GKE; OCI → OKE. The server rejects mismatched pairs.</w:t>
+      </w:r>
+    </w:p>
+    <w:p>
+      <w:pPr>
+        <w:pStyle w:val="Compact"/>
+        <w:numPr>
+          <w:ilvl w:val="0"/>
+          <w:numId w:val="1061"/>
+        </w:numPr>
+      </w:pPr>
+      <w:r>
+        <w:t>Create requests require kubernetesDistribution in addition to cloudProvider. Customer, provider and distribution are immutable after creation; create another environment to change them.</w:t>
+      </w:r>
+    </w:p>
+    <w:p>
+      <w:pPr>
+        <w:pStyle w:val="Compact"/>
+        <w:numPr>
+          <w:ilvl w:val="0"/>
+          <w:numId w:val="1061"/>
+        </w:numPr>
+      </w:pPr>
+      <w:r>
+        <w:t>configurationSchemaVersion is 1.0 for all four distributions. Document version 1.1 does not change configuration schema version 1.0.</w:t>
+      </w:r>
+    </w:p>
+    <w:p>
+      <w:pPr>
+        <w:pStyle w:val="Compact"/>
+        <w:numPr>
+          <w:ilvl w:val="0"/>
+          <w:numId w:val="1061"/>
+        </w:numPr>
+      </w:pPr>
+      <w:r>
+        <w:t>Schemas are packaged at src/navigan/modules/environment_management/schemas. Relational columns store identity and governance; provider infrastructure remains JSONB.</w:t>
+      </w:r>
+    </w:p>
+    <w:p>
+      <w:pPr>
+        <w:pStyle w:val="Compact"/>
+        <w:numPr>
+          <w:ilvl w:val="0"/>
+          <w:numId w:val="1061"/>
+        </w:numPr>
+      </w:pPr>
+      <w:r>
+        <w:t>GET /api/v1/environments/metadata returns active database-configured environment types and supported distribution/schema pairs. GET /api/v1/environments/configuration-schemas/{distribution}/{schemaVersion} returns the JSON Schema used by both backend validation and the dynamic form. Both endpoints require the existing verified JWT and navigan/api scope.</w:t>
+      </w:r>
+    </w:p>
+    <w:p>
+      <w:pPr>
+        <w:pStyle w:val="Compact"/>
+        <w:numPr>
+          <w:ilvl w:val="0"/>
+          <w:numId w:val="1061"/>
+        </w:numPr>
+      </w:pPr>
+      <w:r>
+        <w:t>Drafts may omit required fields. Supplied values must have the right types/formats. Submission applies required fields and provider-specific cross-field checks. Additive extension attributes require no ALTER TABLE; editing a schema or introducing a new schema version still requires a code deployment.</w:t>
+      </w:r>
+    </w:p>
+    <w:p>
+      <w:r>
+        <w:t>Common required baseline: location.region, connectivity.egressMode (NAT, PRIVATE_ENDPOINTS or PROXY), and tags.Owner, tags.CostCenter and tags.Environment. These are Navigan governance requirements, not claims that every cloud mandates those exact fields. Optional dns, proxy and extensions objects hold infrastructure references only. Actual endpoint access settings, Kubernetes version, node sizing, individual cluster ranges and workload settings remain in Cluster Management.</w:t>
+      </w:r>
+    </w:p>
+    <w:p>
+      <w:r>
+        <w:t>Validation checks structure and references; it does not authenticate to Azure, Google Cloud, Oracle Cloud or AWS to verify resource existence. Architects must verify resource ownership, permissions, region consistency, network capacity and reachability during review.</w:t>
+      </w:r>
+    </w:p>
+    <w:p>
+      <w:pPr>
+        <w:pStyle w:val="Heading1"/>
+      </w:pPr>
+      <w:r>
+        <w:t>65. Azure AKS baseline</w:t>
+      </w:r>
+    </w:p>
+    <w:p>
+      <w:r>
+        <w:t>Select cloudProvider=AZURE and kubernetesDistribution=AKS. Capture the reusable subscription, virtual network and managed-identity foundation. Approved subnet and identity resource IDs are reusable references; the environment does not create an AKS cluster.</w:t>
+      </w:r>
+    </w:p>
+    <w:p>
+      <w:pPr>
+        <w:pStyle w:val="Compact"/>
+        <w:numPr>
+          <w:ilvl w:val="0"/>
+          <w:numId w:val="1061"/>
+        </w:numPr>
+      </w:pPr>
+      <w:r>
+        <w:t>account: tenantId, subscriptionId and resourceGroup.</w:t>
+      </w:r>
+    </w:p>
+    <w:p>
+      <w:pPr>
+        <w:pStyle w:val="Compact"/>
+        <w:numPr>
+          <w:ilvl w:val="0"/>
+          <w:numId w:val="1061"/>
+        </w:numPr>
+      </w:pPr>
+      <w:r>
+        <w:t>location: Azure region in region.</w:t>
+      </w:r>
+    </w:p>
+    <w:p>
+      <w:pPr>
+        <w:pStyle w:val="Compact"/>
+        <w:numPr>
+          <w:ilvl w:val="0"/>
+          <w:numId w:val="1061"/>
+        </w:numPr>
+      </w:pPr>
+      <w:r>
+        <w:t>network: vnetResourceId and one or more nodeSubnetResourceIds; apiServerSubnetResourceId is optional and used only when the later cluster design requires API Server VNet Integration.</w:t>
+      </w:r>
+    </w:p>
+    <w:p>
+      <w:pPr>
+        <w:pStyle w:val="Compact"/>
+        <w:numPr>
+          <w:ilvl w:val="0"/>
+          <w:numId w:val="1061"/>
+        </w:numPr>
+      </w:pPr>
+      <w:r>
+        <w:t>identity: controlPlaneIdentityResourceId and kubeletIdentityResourceId. This baseline policy uses approved user-assigned managed identities.</w:t>
+      </w:r>
+    </w:p>
+    <w:p>
+      <w:pPr>
+        <w:pStyle w:val="Compact"/>
+        <w:numPr>
+          <w:ilvl w:val="0"/>
+          <w:numId w:val="1061"/>
+        </w:numPr>
+      </w:pPr>
+      <w:r>
+        <w:t>security: networkSecurityGroupResourceIds. Architects verify required traffic permissions.</w:t>
+      </w:r>
+    </w:p>
+    <w:p>
+      <w:pPr>
+        <w:pStyle w:val="Compact"/>
+        <w:numPr>
+          <w:ilvl w:val="0"/>
+          <w:numId w:val="1061"/>
+        </w:numPr>
+      </w:pPr>
+      <w:r>
+        <w:t>encryption: mode is PROVIDER_MANAGED or CUSTOMER_MANAGED. CUSTOMER_MANAGED requires diskEncryptionSetResourceId; keyVaultKeyId may reference the approved key. Never store client secrets or certificates.</w:t>
+      </w:r>
+    </w:p>
+    <w:p>
+      <w:r>
+        <w:t>Resource IDs use the Azure /subscriptions/.../resourceGroups/.../providers/... form. DNS, private endpoints, routing and proxy requirements can be captured as additional network fields or extensions.</w:t>
+      </w:r>
+    </w:p>
+    <w:p>
+      <w:pPr>
+        <w:pStyle w:val="Heading1"/>
+      </w:pPr>
+      <w:r>
+        <w:t>66. Google Kubernetes Engine baseline</w:t>
+      </w:r>
+    </w:p>
+    <w:p>
+      <w:r>
+        <w:t>Select cloudProvider=GCP and kubernetesDistribution=GKE. The initial Navigan baseline uses approved VPC-native networking resources; the final cluster network settings remain a Cluster Management decision.</w:t>
+      </w:r>
+    </w:p>
+    <w:p>
+      <w:pPr>
+        <w:pStyle w:val="Compact"/>
+        <w:numPr>
+          <w:ilvl w:val="0"/>
+          <w:numId w:val="1061"/>
+        </w:numPr>
+      </w:pPr>
+      <w:r>
+        <w:t>account: projectId; optional hostProjectId for a Shared VPC.</w:t>
+      </w:r>
+    </w:p>
+    <w:p>
+      <w:pPr>
+        <w:pStyle w:val="Compact"/>
+        <w:numPr>
+          <w:ilvl w:val="0"/>
+          <w:numId w:val="1061"/>
+        </w:numPr>
+      </w:pPr>
+      <w:r>
+        <w:t>location: region.</w:t>
+      </w:r>
+    </w:p>
+    <w:p>
+      <w:pPr>
+        <w:pStyle w:val="Compact"/>
+        <w:numPr>
+          <w:ilvl w:val="0"/>
+          <w:numId w:val="1061"/>
+        </w:numPr>
+      </w:pPr>
+      <w:r>
+        <w:t>network: networkResourceName (projects/{project}/global/networks/{network}), subnetworkResourceName (projects/{project}/regions/{region}/subnetworks/{subnet}), podSecondaryRangeNames and serviceSecondaryRangeNames. These are approved available ranges, not an allocation to a new cluster.</w:t>
+      </w:r>
+    </w:p>
+    <w:p>
+      <w:pPr>
+        <w:pStyle w:val="Compact"/>
+        <w:numPr>
+          <w:ilvl w:val="0"/>
+          <w:numId w:val="1061"/>
+        </w:numPr>
+      </w:pPr>
+      <w:r>
+        <w:t>identity: nodeServiceAccountEmail. Store the service-account identity only, never its JSON private key.</w:t>
+      </w:r>
+    </w:p>
+    <w:p>
+      <w:pPr>
+        <w:pStyle w:val="Compact"/>
+        <w:numPr>
+          <w:ilvl w:val="0"/>
+          <w:numId w:val="1061"/>
+        </w:numPr>
+      </w:pPr>
+      <w:r>
+        <w:t>security: firewallPolicyReferences.</w:t>
+      </w:r>
+    </w:p>
+    <w:p>
+      <w:pPr>
+        <w:pStyle w:val="Compact"/>
+        <w:numPr>
+          <w:ilvl w:val="0"/>
+          <w:numId w:val="1061"/>
+        </w:numPr>
+      </w:pPr>
+      <w:r>
+        <w:t>encryption: PROVIDER_MANAGED or CUSTOMER_MANAGED; the latter requires kmsKeyResourceName in projects/.../locations/.../keyRings/.../cryptoKeys/... form.</w:t>
+      </w:r>
+    </w:p>
+    <w:p>
+      <w:pPr>
+        <w:pStyle w:val="Heading1"/>
+      </w:pPr>
+      <w:r>
+        <w:t>67. Oracle Cloud OKE baseline</w:t>
+      </w:r>
+    </w:p>
+    <w:p>
+      <w:r>
+        <w:t>Select cloudProvider=OCI and kubernetesDistribution=OKE. Capture tenancy, compartment and VCN references with OCI OCIDs. OKE does not inherit AWS requirements for two availability zones; use approved regional OCI subnets appropriate to the later cluster design.</w:t>
+      </w:r>
+    </w:p>
+    <w:p>
+      <w:pPr>
+        <w:pStyle w:val="Compact"/>
+        <w:numPr>
+          <w:ilvl w:val="0"/>
+          <w:numId w:val="1061"/>
+        </w:numPr>
+      </w:pPr>
+      <w:r>
+        <w:t>account: tenancyOcid and compartmentOcid.</w:t>
+      </w:r>
+    </w:p>
+    <w:p>
+      <w:pPr>
+        <w:pStyle w:val="Compact"/>
+        <w:numPr>
+          <w:ilvl w:val="0"/>
+          <w:numId w:val="1061"/>
+        </w:numPr>
+      </w:pPr>
+      <w:r>
+        <w:t>location: region.</w:t>
+      </w:r>
+    </w:p>
+    <w:p>
+      <w:pPr>
+        <w:pStyle w:val="Compact"/>
+        <w:numPr>
+          <w:ilvl w:val="0"/>
+          <w:numId w:val="1061"/>
+        </w:numPr>
+      </w:pPr>
+      <w:r>
+        <w:t>network: vcnOcid, apiEndpointSubnetOcid and nodeSubnetOcids; optional loadBalancerSubnetOcids.</w:t>
+      </w:r>
+    </w:p>
+    <w:p>
+      <w:pPr>
+        <w:pStyle w:val="Compact"/>
+        <w:numPr>
+          <w:ilvl w:val="0"/>
+          <w:numId w:val="1061"/>
+        </w:numPr>
+      </w:pPr>
+      <w:r>
+        <w:t>identity: policyOcids for the approved OCI IAM policy baseline.</w:t>
+      </w:r>
+    </w:p>
+    <w:p>
+      <w:pPr>
+        <w:pStyle w:val="Compact"/>
+        <w:numPr>
+          <w:ilvl w:val="0"/>
+          <w:numId w:val="1061"/>
+        </w:numPr>
+      </w:pPr>
+      <w:r>
+        <w:t>security: networkSecurityGroupOcids. Additional security-list and gateway references can be supplied as extensions.</w:t>
+      </w:r>
+    </w:p>
+    <w:p>
+      <w:pPr>
+        <w:pStyle w:val="Compact"/>
+        <w:numPr>
+          <w:ilvl w:val="0"/>
+          <w:numId w:val="1061"/>
+        </w:numPr>
+      </w:pPr>
+      <w:r>
+        <w:t>encryption: PROVIDER_MANAGED or CUSTOMER_MANAGED; the latter requires kmsKeyOcid. Never store OCI signing keys or authentication tokens.</w:t>
+      </w:r>
+    </w:p>
+    <w:p>
+      <w:pPr>
+        <w:pStyle w:val="Heading1"/>
+      </w:pPr>
+      <w:r>
+        <w:t>68. API, authorization and versioning decisions</w:t>
+      </w:r>
+    </w:p>
+    <w:p>
+      <w:pPr>
+        <w:pStyle w:val="Compact"/>
+        <w:numPr>
+          <w:ilvl w:val="0"/>
+          <w:numId w:val="1061"/>
+        </w:numPr>
+      </w:pPr>
+      <w:r>
+        <w:t>All writes require an Idempotency-Key. Updates and lifecycle actions require a positive integer version in the body, or If-Match; when both are supplied they must agree. Stale writes return 409 CONCURRENT_UPDATE. Retry the same request with the same key; changed input needs a new key.</w:t>
+      </w:r>
+    </w:p>
+    <w:p>
+      <w:pPr>
+        <w:pStyle w:val="Compact"/>
+        <w:numPr>
+          <w:ilvl w:val="0"/>
+          <w:numId w:val="1061"/>
+        </w:numPr>
+      </w:pPr>
+      <w:r>
+        <w:t>Cloud Engineers create and submit/resubmit. Cloud Engineers and Platform Architects edit DRAFT/REJECTED. Only Platform Architects review, approve, reject, activate, suspend, reactivate and deactivate. Full audit access is architect-only; scoped users may read status, reviews and versions.</w:t>
+      </w:r>
+    </w:p>
+    <w:p>
+      <w:pPr>
+        <w:pStyle w:val="Compact"/>
+        <w:numPr>
+          <w:ilvl w:val="0"/>
+          <w:numId w:val="1061"/>
+        </w:numPr>
+      </w:pPr>
+      <w:r>
+        <w:t>Existing Cognito roles, customer_ids, platform_scope and customer-creator ownership rules apply unchanged. User-supplied identity headers are never trusted. A Cloud Engineer does not need the customer_create entitlement for environments belonging to an explicitly assigned customer.</w:t>
+      </w:r>
+    </w:p>
+    <w:p>
+      <w:pPr>
+        <w:pStyle w:val="Compact"/>
+        <w:numPr>
+          <w:ilvl w:val="0"/>
+          <w:numId w:val="1061"/>
+        </w:numPr>
+      </w:pPr>
+      <w:r>
+        <w:t>Customer must exist and not be deactivated to create/edit a draft. Submission, approval, activation and reactivation require an ACTIVE customer and an active associated provider. The composite provider association foreign key prevents removing a customer/provider association while an environment references it.</w:t>
+      </w:r>
+    </w:p>
+    <w:p>
+      <w:pPr>
+        <w:pStyle w:val="Compact"/>
+        <w:numPr>
+          <w:ilvl w:val="0"/>
+          <w:numId w:val="1061"/>
+        </w:numPr>
+      </w:pPr>
+      <w:r>
+        <w:t>Environment uniqueness remains customer + provider + case-insensitive trimmed environmentName. No physical deletion endpoint is provided.</w:t>
+      </w:r>
+    </w:p>
+    <w:p>
+      <w:pPr>
+        <w:pStyle w:val="Compact"/>
+        <w:numPr>
+          <w:ilvl w:val="0"/>
+          <w:numId w:val="1061"/>
+        </w:numPr>
+      </w:pPr>
+      <w:r>
+        <w:t>Every successful mutation, including workflow actions, increments version and writes an immutable snapshot, audit record and transactional outbox event. Approval stores approvedVersion equal to the approval snapshot version. Later activation does not overwrite approvedVersion.</w:t>
+      </w:r>
+    </w:p>
+    <w:p>
+      <w:pPr>
+        <w:pStyle w:val="Compact"/>
+        <w:numPr>
+          <w:ilvl w:val="0"/>
+          <w:numId w:val="1061"/>
+        </w:numPr>
+      </w:pPr>
+      <w:r>
+        <w:t>Cluster consumers must verify current environment and customer are ACTIVE, then fetch /versions/{approvedVersion} and pin environmentId plus approvedVersion. Snapshot status may be APPROVED; current lifecycle eligibility is checked separately.</w:t>
+      </w:r>
+    </w:p>
+    <w:p>
+      <w:pPr>
+        <w:pStyle w:val="Compact"/>
+        <w:numPr>
+          <w:ilvl w:val="0"/>
+          <w:numId w:val="1061"/>
+        </w:numPr>
+      </w:pPr>
+      <w:r>
+        <w:t>List responses use items and pagination. Detail responses include customerName, configuration, approvedVersion and workflow metadata. History is paginated separately. Full endpoint contracts are in docs/environment-openapi.json.</w:t>
+      </w:r>
+    </w:p>
+    <w:p>
+      <w:pPr>
+        <w:pStyle w:val="Compact"/>
+        <w:numPr>
+          <w:ilvl w:val="0"/>
+          <w:numId w:val="1061"/>
+        </w:numPr>
+      </w:pPr>
+      <w:r>
+        <w:t>GET /{id}/versions returns version summaries; GET /{id}/versions/{version} returns the immutable full snapshot. GET /{id}/reviews and GET /{id}/audit-log provide review and full audit records.</w:t>
+      </w:r>
+    </w:p>
+    <w:p>
+      <w:pPr>
+        <w:pStyle w:val="Compact"/>
+        <w:numPr>
+          <w:ilvl w:val="0"/>
+          <w:numId w:val="1061"/>
+        </w:numPr>
+      </w:pPr>
+      <w:r>
+        <w:t>POST /{id}/resubmit, /suspend, /reactivate and /deactivate are explicit routes. PATCH /{id}/status accepts SUSPENDED, ACTIVE (reactivate only) or DEACTIVATED, plus version and reason where required. Approval activation uses POST /{id}/activate.</w:t>
+      </w:r>
+    </w:p>
+    <w:p>
+      <w:pPr>
+        <w:pStyle w:val="Compact"/>
+        <w:numPr>
+          <w:ilvl w:val="0"/>
+          <w:numId w:val="1061"/>
+        </w:numPr>
+      </w:pPr>
+      <w:r>
+        <w:t>Rejected, suspended and deactivated actions require a reason. Previous reasons/comments remain in immutable history. Allowed statuses and role transitions follow section 47.</w:t>
+      </w:r>
+    </w:p>
+    <w:p>
+      <w:pPr>
+        <w:pStyle w:val="Compact"/>
+        <w:numPr>
+          <w:ilvl w:val="0"/>
+          <w:numId w:val="1061"/>
+        </w:numPr>
+      </w:pPr>
+      <w:r>
+        <w:t>Error responses use the existing platform envelope: error.code, error.message, error.details (an object; validation uses details.fields) and error.correlationId. No raw SQL, credentials or submitted values appear in validation messages.</w:t>
+      </w:r>
+    </w:p>
+    <w:p>
+      <w:pPr>
+        <w:pStyle w:val="Heading1"/>
+      </w:pPr>
+      <w:r>
+        <w:t>69. Deployment, diagnostics and operational acceptance</w:t>
+      </w:r>
+    </w:p>
+    <w:p>
+      <w:r>
+        <w:t>Apply migration 002_environment_management.sql through scripts/migrate.py and reapply database/bootstrap/roles.sql before deploying the new backend. The EnvironmentManagement nested stack reuses the shared API Gateway, authorizer, database secret, private subnets, Lambda security groups and CA layer. Do not create a new Cognito app client or change the working frontend API base path.</w:t>
+      </w:r>
+    </w:p>
+    <w:p>
+      <w:r>
+        <w:t>The frontend proxy now permits Environment routes, including PATCH status and schema discovery, and the handler normalizes the API Gateway v1 stage prefix. Rebuild and deploy the ECS image after deploying the backend. Detailed commands and rollback considerations are in docs/environment-management.md.</w:t>
+      </w:r>
+    </w:p>
+    <w:p>
+      <w:r>
+        <w:t>Logs record initialization, identity checks, environment operations, schema validation, secret retrieval, database connection, query execution and transaction completion. They include request/correlation IDs, phase duration and safe failure locations. They exclude configuration bodies, tokens, SQL parameters and credentials. Secrets Manager calls use three-second connection/read timeouts with one attempt; database connection/statement/lock timeouts remain five/eight/five seconds. These are operation limits, not an absolute request deadline.</w:t>
+      </w:r>
+    </w:p>
+    <w:p>
+      <w:r>
+        <w:t>For ConnectTimeoutError during secret_fetch, verify the existing Secrets Manager interface endpoint/private DNS and HTTPS 443 security-group path, or the private subnet NAT route. RDS access needs TCP 5432 and the RDS CA bundle. Reuse the corrected networking established during Customer Management troubleshooting.</w:t>
+      </w:r>
+    </w:p>
+    <w:p>
+      <w:r>
+        <w:t>Environment events use source navigan.environment-management and the existing transactional outbox publisher. Notification or provisioning consumers may subscribe separately. Saving or approving an environment never provisions a cluster.</w:t>
+      </w:r>
+    </w:p>
+    <w:p>
+      <w:r>
+        <w:t>Acceptance includes all four provider schemas, incomplete drafts, required submit validation, provider mismatch, cross-customer denial, optimistic locking, idempotent retries, immutable histories, lifecycle guards, scoped list filters, gateway/proxy routes and dynamic UI forms. Production rollout requires running migrations and deploying both backend and frontend; repository verification does not itself deploy AWS resources.</w:t>
+      </w:r>
+    </w:p>
+    <w:p>
+      <w:pPr>
+        <w:spacing w:after="0" w:before="0"/>
+      </w:pPr>
+      <w:r>
+        <w:rPr>
+          <w:sz w:val="16"/>
+        </w:rPr>
+        <w:t>Provider references (reviewed 7 September 2026):</w:t>
+      </w:r>
+    </w:p>
+    <w:p>
+      <w:pPr>
+        <w:spacing w:after="0" w:before="0"/>
+      </w:pPr>
+      <w:r>
+        <w:rPr>
+          <w:sz w:val="16"/>
+        </w:rPr>
+        <w:t>https://learn.microsoft.com/en-us/azure/aks/concepts-network</w:t>
+      </w:r>
+    </w:p>
+    <w:p>
+      <w:pPr>
+        <w:spacing w:after="0" w:before="0"/>
+      </w:pPr>
+      <w:r>
+        <w:rPr>
+          <w:sz w:val="16"/>
+        </w:rPr>
+        <w:t>https://learn.microsoft.com/en-us/azure/aks/managed-identity-overview</w:t>
+      </w:r>
+    </w:p>
+    <w:p>
+      <w:pPr>
+        <w:spacing w:after="0" w:before="0"/>
+      </w:pPr>
+      <w:r>
+        <w:rPr>
+          <w:sz w:val="16"/>
+        </w:rPr>
+        <w:t>https://docs.cloud.google.com/kubernetes-engine/docs/concepts/alias-ips</w:t>
+      </w:r>
+    </w:p>
+    <w:p>
+      <w:pPr>
+        <w:spacing w:after="0" w:before="0"/>
+      </w:pPr>
+      <w:r>
+        <w:rPr>
+          <w:sz w:val="16"/>
+        </w:rPr>
+        <w:t>https://docs.oracle.com/en-us/iaas/Content/ContEng/Concepts/contengnetworkconfig.htm</w:t>
+      </w:r>
+    </w:p>
     <w:sectPr>
       <w:footnotePr>
         <w:numRestart w:val="eachSect"/>
@@ -25838,6 +26484,20 @@
     <w:lvlOverride w:ilvl="8">
       <w:startOverride w:val="32"/>
     </w:lvlOverride>
+  </w:num>
+  <w:abstractNum w:abstractNumId="994133">
+    <w:lvl w:ilvl="0">
+      <w:start w:val="1"/>
+      <w:numFmt w:val="bullet"/>
+      <w:lvlText w:val="•"/>
+      <w:lvlJc w:val="left"/>
+      <w:pPr>
+        <w:ind w:left="360" w:hanging="180"/>
+      </w:pPr>
+    </w:lvl>
+  </w:abstractNum>
+  <w:num w:numId="1061">
+    <w:abstractNumId w:val="994133"/>
   </w:num>
 </w:numbering>
 </file>

</xml_diff>

<commit_message>
Align outbox timeout test and browser selectors; improve specification tables
</commit_message>
<xml_diff>
--- a/docs/Navigan_Environment_Management_Specification_v1.docx
+++ b/docs/Navigan_Environment_Management_Specification_v1.docx
@@ -18313,14 +18313,15 @@
     <w:tbl>
       <w:tblPr>
         <w:tblStyle w:val="Table"/>
-        <w:tblW w:type="auto" w:w="0"/>
+        <w:tblW w:type="dxa" w:w="9360"/>
+        <w:tblLayout w:type="fixed"/>
         <w:tblLook w:firstRow="1" w:lastRow="0" w:firstColumn="0" w:lastColumn="0" w:noHBand="0" w:noVBand="0" w:val="0020"/>
       </w:tblPr>
       <w:tblGrid>
-        <w:gridCol w:w="1980"/>
-        <w:gridCol w:w="1980"/>
-        <w:gridCol w:w="1980"/>
-        <w:gridCol w:w="1980"/>
+        <w:gridCol w:w="2400"/>
+        <w:gridCol w:w="2160"/>
+        <w:gridCol w:w="2400"/>
+        <w:gridCol w:w="2400"/>
       </w:tblGrid>
       <w:tr>
         <w:trPr>
@@ -18328,45 +18329,65 @@
           <w:cantSplit/>
         </w:trPr>
         <w:tc>
-          <w:tcPr/>
+          <w:tcPr>
+            <w:tcW w:w="2400" w:type="dxa"/>
+          </w:tcPr>
           <w:p>
             <w:pPr>
               <w:pStyle w:val="Compact"/>
             </w:pPr>
             <w:r>
+              <w:rPr>
+                <w:sz w:val="19"/>
+              </w:rPr>
               <w:t xml:space="preserve">Current Status</w:t>
             </w:r>
           </w:p>
         </w:tc>
         <w:tc>
-          <w:tcPr/>
+          <w:tcPr>
+            <w:tcW w:w="2160" w:type="dxa"/>
+          </w:tcPr>
           <w:p>
             <w:pPr>
               <w:pStyle w:val="Compact"/>
             </w:pPr>
             <w:r>
+              <w:rPr>
+                <w:sz w:val="19"/>
+              </w:rPr>
               <w:t xml:space="preserve">Action</w:t>
             </w:r>
           </w:p>
         </w:tc>
         <w:tc>
-          <w:tcPr/>
+          <w:tcPr>
+            <w:tcW w:w="2400" w:type="dxa"/>
+          </w:tcPr>
           <w:p>
             <w:pPr>
               <w:pStyle w:val="Compact"/>
             </w:pPr>
             <w:r>
+              <w:rPr>
+                <w:sz w:val="19"/>
+              </w:rPr>
               <w:t xml:space="preserve">Role</w:t>
             </w:r>
           </w:p>
         </w:tc>
         <w:tc>
-          <w:tcPr/>
+          <w:tcPr>
+            <w:tcW w:w="2400" w:type="dxa"/>
+          </w:tcPr>
           <w:p>
             <w:pPr>
               <w:pStyle w:val="Compact"/>
             </w:pPr>
             <w:r>
+              <w:rPr>
+                <w:sz w:val="19"/>
+              </w:rPr>
               <w:t xml:space="preserve">Result</w:t>
             </w:r>
           </w:p>
@@ -18377,45 +18398,65 @@
           <w:cantSplit/>
         </w:trPr>
         <w:tc>
-          <w:tcPr/>
+          <w:tcPr>
+            <w:tcW w:w="2400" w:type="dxa"/>
+          </w:tcPr>
           <w:p>
             <w:pPr>
               <w:pStyle w:val="Compact"/>
             </w:pPr>
             <w:r>
+              <w:rPr>
+                <w:sz w:val="19"/>
+              </w:rPr>
               <w:t xml:space="preserve">DRAFT</w:t>
             </w:r>
           </w:p>
         </w:tc>
         <w:tc>
-          <w:tcPr/>
+          <w:tcPr>
+            <w:tcW w:w="2160" w:type="dxa"/>
+          </w:tcPr>
           <w:p>
             <w:pPr>
               <w:pStyle w:val="Compact"/>
             </w:pPr>
             <w:r>
+              <w:rPr>
+                <w:sz w:val="19"/>
+              </w:rPr>
               <w:t xml:space="preserve">Update</w:t>
             </w:r>
           </w:p>
         </w:tc>
         <w:tc>
-          <w:tcPr/>
+          <w:tcPr>
+            <w:tcW w:w="2400" w:type="dxa"/>
+          </w:tcPr>
           <w:p>
             <w:pPr>
               <w:pStyle w:val="Compact"/>
             </w:pPr>
             <w:r>
+              <w:rPr>
+                <w:sz w:val="19"/>
+              </w:rPr>
               <w:t xml:space="preserve">Cloud Engineer</w:t>
             </w:r>
           </w:p>
         </w:tc>
         <w:tc>
-          <w:tcPr/>
+          <w:tcPr>
+            <w:tcW w:w="2400" w:type="dxa"/>
+          </w:tcPr>
           <w:p>
             <w:pPr>
               <w:pStyle w:val="Compact"/>
             </w:pPr>
             <w:r>
+              <w:rPr>
+                <w:sz w:val="19"/>
+              </w:rPr>
               <w:t xml:space="preserve">DRAFT</w:t>
             </w:r>
           </w:p>
@@ -18426,45 +18467,65 @@
           <w:cantSplit/>
         </w:trPr>
         <w:tc>
-          <w:tcPr/>
+          <w:tcPr>
+            <w:tcW w:w="2400" w:type="dxa"/>
+          </w:tcPr>
           <w:p>
             <w:pPr>
               <w:pStyle w:val="Compact"/>
             </w:pPr>
             <w:r>
+              <w:rPr>
+                <w:sz w:val="19"/>
+              </w:rPr>
               <w:t xml:space="preserve">DRAFT</w:t>
             </w:r>
           </w:p>
         </w:tc>
         <w:tc>
-          <w:tcPr/>
+          <w:tcPr>
+            <w:tcW w:w="2160" w:type="dxa"/>
+          </w:tcPr>
           <w:p>
             <w:pPr>
               <w:pStyle w:val="Compact"/>
             </w:pPr>
             <w:r>
+              <w:rPr>
+                <w:sz w:val="19"/>
+              </w:rPr>
               <w:t xml:space="preserve">Submit</w:t>
             </w:r>
           </w:p>
         </w:tc>
         <w:tc>
-          <w:tcPr/>
+          <w:tcPr>
+            <w:tcW w:w="2400" w:type="dxa"/>
+          </w:tcPr>
           <w:p>
             <w:pPr>
               <w:pStyle w:val="Compact"/>
             </w:pPr>
             <w:r>
+              <w:rPr>
+                <w:sz w:val="19"/>
+              </w:rPr>
               <w:t xml:space="preserve">Cloud Engineer</w:t>
             </w:r>
           </w:p>
         </w:tc>
         <w:tc>
-          <w:tcPr/>
+          <w:tcPr>
+            <w:tcW w:w="2400" w:type="dxa"/>
+          </w:tcPr>
           <w:p>
             <w:pPr>
               <w:pStyle w:val="Compact"/>
             </w:pPr>
             <w:r>
+              <w:rPr>
+                <w:sz w:val="19"/>
+              </w:rPr>
               <w:t xml:space="preserve">SUBMITTED</w:t>
             </w:r>
           </w:p>
@@ -18475,45 +18536,65 @@
           <w:cantSplit/>
         </w:trPr>
         <w:tc>
-          <w:tcPr/>
+          <w:tcPr>
+            <w:tcW w:w="2400" w:type="dxa"/>
+          </w:tcPr>
           <w:p>
             <w:pPr>
               <w:pStyle w:val="Compact"/>
             </w:pPr>
             <w:r>
+              <w:rPr>
+                <w:sz w:val="19"/>
+              </w:rPr>
               <w:t xml:space="preserve">SUBMITTED</w:t>
             </w:r>
           </w:p>
         </w:tc>
         <w:tc>
-          <w:tcPr/>
+          <w:tcPr>
+            <w:tcW w:w="2160" w:type="dxa"/>
+          </w:tcPr>
           <w:p>
             <w:pPr>
               <w:pStyle w:val="Compact"/>
             </w:pPr>
             <w:r>
+              <w:rPr>
+                <w:sz w:val="19"/>
+              </w:rPr>
               <w:t xml:space="preserve">Start Review</w:t>
             </w:r>
           </w:p>
         </w:tc>
         <w:tc>
-          <w:tcPr/>
+          <w:tcPr>
+            <w:tcW w:w="2400" w:type="dxa"/>
+          </w:tcPr>
           <w:p>
             <w:pPr>
               <w:pStyle w:val="Compact"/>
             </w:pPr>
             <w:r>
+              <w:rPr>
+                <w:sz w:val="19"/>
+              </w:rPr>
               <w:t xml:space="preserve">Platform Architect</w:t>
             </w:r>
           </w:p>
         </w:tc>
         <w:tc>
-          <w:tcPr/>
+          <w:tcPr>
+            <w:tcW w:w="2400" w:type="dxa"/>
+          </w:tcPr>
           <w:p>
             <w:pPr>
               <w:pStyle w:val="Compact"/>
             </w:pPr>
             <w:r>
+              <w:rPr>
+                <w:sz w:val="19"/>
+              </w:rPr>
               <w:t xml:space="preserve">UNDER_REVIEW</w:t>
             </w:r>
           </w:p>
@@ -18524,45 +18605,65 @@
           <w:cantSplit/>
         </w:trPr>
         <w:tc>
-          <w:tcPr/>
+          <w:tcPr>
+            <w:tcW w:w="2400" w:type="dxa"/>
+          </w:tcPr>
           <w:p>
             <w:pPr>
               <w:pStyle w:val="Compact"/>
             </w:pPr>
             <w:r>
+              <w:rPr>
+                <w:sz w:val="19"/>
+              </w:rPr>
               <w:t xml:space="preserve">UNDER_REVIEW</w:t>
             </w:r>
           </w:p>
         </w:tc>
         <w:tc>
-          <w:tcPr/>
+          <w:tcPr>
+            <w:tcW w:w="2160" w:type="dxa"/>
+          </w:tcPr>
           <w:p>
             <w:pPr>
               <w:pStyle w:val="Compact"/>
             </w:pPr>
             <w:r>
+              <w:rPr>
+                <w:sz w:val="19"/>
+              </w:rPr>
               <w:t xml:space="preserve">Approve</w:t>
             </w:r>
           </w:p>
         </w:tc>
         <w:tc>
-          <w:tcPr/>
+          <w:tcPr>
+            <w:tcW w:w="2400" w:type="dxa"/>
+          </w:tcPr>
           <w:p>
             <w:pPr>
               <w:pStyle w:val="Compact"/>
             </w:pPr>
             <w:r>
+              <w:rPr>
+                <w:sz w:val="19"/>
+              </w:rPr>
               <w:t xml:space="preserve">Platform Architect</w:t>
             </w:r>
           </w:p>
         </w:tc>
         <w:tc>
-          <w:tcPr/>
+          <w:tcPr>
+            <w:tcW w:w="2400" w:type="dxa"/>
+          </w:tcPr>
           <w:p>
             <w:pPr>
               <w:pStyle w:val="Compact"/>
             </w:pPr>
             <w:r>
+              <w:rPr>
+                <w:sz w:val="19"/>
+              </w:rPr>
               <w:t xml:space="preserve">APPROVED</w:t>
             </w:r>
           </w:p>
@@ -18573,45 +18674,65 @@
           <w:cantSplit/>
         </w:trPr>
         <w:tc>
-          <w:tcPr/>
+          <w:tcPr>
+            <w:tcW w:w="2400" w:type="dxa"/>
+          </w:tcPr>
           <w:p>
             <w:pPr>
               <w:pStyle w:val="Compact"/>
             </w:pPr>
             <w:r>
+              <w:rPr>
+                <w:sz w:val="19"/>
+              </w:rPr>
               <w:t xml:space="preserve">UNDER_REVIEW</w:t>
             </w:r>
           </w:p>
         </w:tc>
         <w:tc>
-          <w:tcPr/>
+          <w:tcPr>
+            <w:tcW w:w="2160" w:type="dxa"/>
+          </w:tcPr>
           <w:p>
             <w:pPr>
               <w:pStyle w:val="Compact"/>
             </w:pPr>
             <w:r>
+              <w:rPr>
+                <w:sz w:val="19"/>
+              </w:rPr>
               <w:t xml:space="preserve">Reject</w:t>
             </w:r>
           </w:p>
         </w:tc>
         <w:tc>
-          <w:tcPr/>
+          <w:tcPr>
+            <w:tcW w:w="2400" w:type="dxa"/>
+          </w:tcPr>
           <w:p>
             <w:pPr>
               <w:pStyle w:val="Compact"/>
             </w:pPr>
             <w:r>
+              <w:rPr>
+                <w:sz w:val="19"/>
+              </w:rPr>
               <w:t xml:space="preserve">Platform Architect</w:t>
             </w:r>
           </w:p>
         </w:tc>
         <w:tc>
-          <w:tcPr/>
+          <w:tcPr>
+            <w:tcW w:w="2400" w:type="dxa"/>
+          </w:tcPr>
           <w:p>
             <w:pPr>
               <w:pStyle w:val="Compact"/>
             </w:pPr>
             <w:r>
+              <w:rPr>
+                <w:sz w:val="19"/>
+              </w:rPr>
               <w:t xml:space="preserve">REJECTED</w:t>
             </w:r>
           </w:p>
@@ -18622,45 +18743,65 @@
           <w:cantSplit/>
         </w:trPr>
         <w:tc>
-          <w:tcPr/>
+          <w:tcPr>
+            <w:tcW w:w="2400" w:type="dxa"/>
+          </w:tcPr>
           <w:p>
             <w:pPr>
               <w:pStyle w:val="Compact"/>
             </w:pPr>
             <w:r>
+              <w:rPr>
+                <w:sz w:val="19"/>
+              </w:rPr>
               <w:t xml:space="preserve">REJECTED</w:t>
             </w:r>
           </w:p>
         </w:tc>
         <w:tc>
-          <w:tcPr/>
+          <w:tcPr>
+            <w:tcW w:w="2160" w:type="dxa"/>
+          </w:tcPr>
           <w:p>
             <w:pPr>
               <w:pStyle w:val="Compact"/>
             </w:pPr>
             <w:r>
+              <w:rPr>
+                <w:sz w:val="19"/>
+              </w:rPr>
               <w:t xml:space="preserve">Update</w:t>
             </w:r>
           </w:p>
         </w:tc>
         <w:tc>
-          <w:tcPr/>
+          <w:tcPr>
+            <w:tcW w:w="2400" w:type="dxa"/>
+          </w:tcPr>
           <w:p>
             <w:pPr>
               <w:pStyle w:val="Compact"/>
             </w:pPr>
             <w:r>
+              <w:rPr>
+                <w:sz w:val="19"/>
+              </w:rPr>
               <w:t xml:space="preserve">Cloud Engineer</w:t>
             </w:r>
           </w:p>
         </w:tc>
         <w:tc>
-          <w:tcPr/>
+          <w:tcPr>
+            <w:tcW w:w="2400" w:type="dxa"/>
+          </w:tcPr>
           <w:p>
             <w:pPr>
               <w:pStyle w:val="Compact"/>
             </w:pPr>
             <w:r>
+              <w:rPr>
+                <w:sz w:val="19"/>
+              </w:rPr>
               <w:t xml:space="preserve">REJECTED</w:t>
             </w:r>
           </w:p>
@@ -18671,45 +18812,65 @@
           <w:cantSplit/>
         </w:trPr>
         <w:tc>
-          <w:tcPr/>
+          <w:tcPr>
+            <w:tcW w:w="2400" w:type="dxa"/>
+          </w:tcPr>
           <w:p>
             <w:pPr>
               <w:pStyle w:val="Compact"/>
             </w:pPr>
             <w:r>
+              <w:rPr>
+                <w:sz w:val="19"/>
+              </w:rPr>
               <w:t xml:space="preserve">REJECTED</w:t>
             </w:r>
           </w:p>
         </w:tc>
         <w:tc>
-          <w:tcPr/>
+          <w:tcPr>
+            <w:tcW w:w="2160" w:type="dxa"/>
+          </w:tcPr>
           <w:p>
             <w:pPr>
               <w:pStyle w:val="Compact"/>
             </w:pPr>
             <w:r>
+              <w:rPr>
+                <w:sz w:val="19"/>
+              </w:rPr>
               <w:t xml:space="preserve">Resubmit</w:t>
             </w:r>
           </w:p>
         </w:tc>
         <w:tc>
-          <w:tcPr/>
+          <w:tcPr>
+            <w:tcW w:w="2400" w:type="dxa"/>
+          </w:tcPr>
           <w:p>
             <w:pPr>
               <w:pStyle w:val="Compact"/>
             </w:pPr>
             <w:r>
+              <w:rPr>
+                <w:sz w:val="19"/>
+              </w:rPr>
               <w:t xml:space="preserve">Cloud Engineer</w:t>
             </w:r>
           </w:p>
         </w:tc>
         <w:tc>
-          <w:tcPr/>
+          <w:tcPr>
+            <w:tcW w:w="2400" w:type="dxa"/>
+          </w:tcPr>
           <w:p>
             <w:pPr>
               <w:pStyle w:val="Compact"/>
             </w:pPr>
             <w:r>
+              <w:rPr>
+                <w:sz w:val="19"/>
+              </w:rPr>
               <w:t xml:space="preserve">SUBMITTED</w:t>
             </w:r>
           </w:p>
@@ -18720,45 +18881,65 @@
           <w:cantSplit/>
         </w:trPr>
         <w:tc>
-          <w:tcPr/>
+          <w:tcPr>
+            <w:tcW w:w="2400" w:type="dxa"/>
+          </w:tcPr>
           <w:p>
             <w:pPr>
               <w:pStyle w:val="Compact"/>
             </w:pPr>
             <w:r>
+              <w:rPr>
+                <w:sz w:val="19"/>
+              </w:rPr>
               <w:t xml:space="preserve">APPROVED</w:t>
             </w:r>
           </w:p>
         </w:tc>
         <w:tc>
-          <w:tcPr/>
+          <w:tcPr>
+            <w:tcW w:w="2160" w:type="dxa"/>
+          </w:tcPr>
           <w:p>
             <w:pPr>
               <w:pStyle w:val="Compact"/>
             </w:pPr>
             <w:r>
+              <w:rPr>
+                <w:sz w:val="19"/>
+              </w:rPr>
               <w:t xml:space="preserve">Activate</w:t>
             </w:r>
           </w:p>
         </w:tc>
         <w:tc>
-          <w:tcPr/>
+          <w:tcPr>
+            <w:tcW w:w="2400" w:type="dxa"/>
+          </w:tcPr>
           <w:p>
             <w:pPr>
               <w:pStyle w:val="Compact"/>
             </w:pPr>
             <w:r>
+              <w:rPr>
+                <w:sz w:val="19"/>
+              </w:rPr>
               <w:t xml:space="preserve">Platform Architect</w:t>
             </w:r>
           </w:p>
         </w:tc>
         <w:tc>
-          <w:tcPr/>
+          <w:tcPr>
+            <w:tcW w:w="2400" w:type="dxa"/>
+          </w:tcPr>
           <w:p>
             <w:pPr>
               <w:pStyle w:val="Compact"/>
             </w:pPr>
             <w:r>
+              <w:rPr>
+                <w:sz w:val="19"/>
+              </w:rPr>
               <w:t xml:space="preserve">ACTIVE</w:t>
             </w:r>
           </w:p>
@@ -18769,45 +18950,65 @@
           <w:cantSplit/>
         </w:trPr>
         <w:tc>
-          <w:tcPr/>
+          <w:tcPr>
+            <w:tcW w:w="2400" w:type="dxa"/>
+          </w:tcPr>
           <w:p>
             <w:pPr>
               <w:pStyle w:val="Compact"/>
             </w:pPr>
             <w:r>
+              <w:rPr>
+                <w:sz w:val="19"/>
+              </w:rPr>
               <w:t xml:space="preserve">ACTIVE</w:t>
             </w:r>
           </w:p>
         </w:tc>
         <w:tc>
-          <w:tcPr/>
+          <w:tcPr>
+            <w:tcW w:w="2160" w:type="dxa"/>
+          </w:tcPr>
           <w:p>
             <w:pPr>
               <w:pStyle w:val="Compact"/>
             </w:pPr>
             <w:r>
+              <w:rPr>
+                <w:sz w:val="19"/>
+              </w:rPr>
               <w:t xml:space="preserve">Suspend</w:t>
             </w:r>
           </w:p>
         </w:tc>
         <w:tc>
-          <w:tcPr/>
+          <w:tcPr>
+            <w:tcW w:w="2400" w:type="dxa"/>
+          </w:tcPr>
           <w:p>
             <w:pPr>
               <w:pStyle w:val="Compact"/>
             </w:pPr>
             <w:r>
+              <w:rPr>
+                <w:sz w:val="19"/>
+              </w:rPr>
               <w:t xml:space="preserve">Platform Architect</w:t>
             </w:r>
           </w:p>
         </w:tc>
         <w:tc>
-          <w:tcPr/>
+          <w:tcPr>
+            <w:tcW w:w="2400" w:type="dxa"/>
+          </w:tcPr>
           <w:p>
             <w:pPr>
               <w:pStyle w:val="Compact"/>
             </w:pPr>
             <w:r>
+              <w:rPr>
+                <w:sz w:val="19"/>
+              </w:rPr>
               <w:t xml:space="preserve">SUSPENDED</w:t>
             </w:r>
           </w:p>
@@ -18818,45 +19019,65 @@
           <w:cantSplit/>
         </w:trPr>
         <w:tc>
-          <w:tcPr/>
+          <w:tcPr>
+            <w:tcW w:w="2400" w:type="dxa"/>
+          </w:tcPr>
           <w:p>
             <w:pPr>
               <w:pStyle w:val="Compact"/>
             </w:pPr>
             <w:r>
+              <w:rPr>
+                <w:sz w:val="19"/>
+              </w:rPr>
               <w:t xml:space="preserve">SUSPENDED</w:t>
             </w:r>
           </w:p>
         </w:tc>
         <w:tc>
-          <w:tcPr/>
+          <w:tcPr>
+            <w:tcW w:w="2160" w:type="dxa"/>
+          </w:tcPr>
           <w:p>
             <w:pPr>
               <w:pStyle w:val="Compact"/>
             </w:pPr>
             <w:r>
+              <w:rPr>
+                <w:sz w:val="19"/>
+              </w:rPr>
               <w:t xml:space="preserve">Reactivate</w:t>
             </w:r>
           </w:p>
         </w:tc>
         <w:tc>
-          <w:tcPr/>
+          <w:tcPr>
+            <w:tcW w:w="2400" w:type="dxa"/>
+          </w:tcPr>
           <w:p>
             <w:pPr>
               <w:pStyle w:val="Compact"/>
             </w:pPr>
             <w:r>
+              <w:rPr>
+                <w:sz w:val="19"/>
+              </w:rPr>
               <w:t xml:space="preserve">Platform Architect</w:t>
             </w:r>
           </w:p>
         </w:tc>
         <w:tc>
-          <w:tcPr/>
+          <w:tcPr>
+            <w:tcW w:w="2400" w:type="dxa"/>
+          </w:tcPr>
           <w:p>
             <w:pPr>
               <w:pStyle w:val="Compact"/>
             </w:pPr>
             <w:r>
+              <w:rPr>
+                <w:sz w:val="19"/>
+              </w:rPr>
               <w:t xml:space="preserve">ACTIVE</w:t>
             </w:r>
           </w:p>
@@ -18867,45 +19088,65 @@
           <w:cantSplit/>
         </w:trPr>
         <w:tc>
-          <w:tcPr/>
+          <w:tcPr>
+            <w:tcW w:w="2400" w:type="dxa"/>
+          </w:tcPr>
           <w:p>
             <w:pPr>
               <w:pStyle w:val="Compact"/>
             </w:pPr>
             <w:r>
+              <w:rPr>
+                <w:sz w:val="19"/>
+              </w:rPr>
               <w:t xml:space="preserve">ACTIVE</w:t>
             </w:r>
           </w:p>
         </w:tc>
         <w:tc>
-          <w:tcPr/>
+          <w:tcPr>
+            <w:tcW w:w="2160" w:type="dxa"/>
+          </w:tcPr>
           <w:p>
             <w:pPr>
               <w:pStyle w:val="Compact"/>
             </w:pPr>
             <w:r>
+              <w:rPr>
+                <w:sz w:val="19"/>
+              </w:rPr>
               <w:t xml:space="preserve">Deactivate</w:t>
             </w:r>
           </w:p>
         </w:tc>
         <w:tc>
-          <w:tcPr/>
+          <w:tcPr>
+            <w:tcW w:w="2400" w:type="dxa"/>
+          </w:tcPr>
           <w:p>
             <w:pPr>
               <w:pStyle w:val="Compact"/>
             </w:pPr>
             <w:r>
+              <w:rPr>
+                <w:sz w:val="19"/>
+              </w:rPr>
               <w:t xml:space="preserve">Platform Architect</w:t>
             </w:r>
           </w:p>
         </w:tc>
         <w:tc>
-          <w:tcPr/>
+          <w:tcPr>
+            <w:tcW w:w="2400" w:type="dxa"/>
+          </w:tcPr>
           <w:p>
             <w:pPr>
               <w:pStyle w:val="Compact"/>
             </w:pPr>
             <w:r>
+              <w:rPr>
+                <w:sz w:val="19"/>
+              </w:rPr>
               <w:t xml:space="preserve">DEACTIVATED</w:t>
             </w:r>
           </w:p>

</xml_diff>